<commit_message>
Regenerate all Word tables at publication quality
- Table 1: Descriptive stats with proper formatting, footnotes, abbreviations
- Table 2: Primary NegBin regression (continuous + quartile models)
- Table 3: Sensitivity analyses (stratified, Spearman, Mann-Whitney)
- Table 4: SVI vs ADI head-to-head comparison (NEW - key table)
- Supplementary: ADI regression + quintile stratification with Q1/Q5 ratio
- Removed raw txt-to-docx conversions (replaced by formatted versions)
- All tables use Medium Shading 1 Accent 1 style, Calibri font, footnotes
</commit_message>
<xml_diff>
--- a/output/requested/Supplementary_Table_ADI_Regression.docx
+++ b/output/requested/Supplementary_Table_ADI_Regression.docx
@@ -4,80 +4,62 @@
   <w:body>
     <w:p>
       <w:pPr>
-        <w:jc w:val="center"/>
+        <w:pStyle w:val="Heading1"/>
       </w:pPr>
       <w:r>
         <w:rPr>
-          <w:rFonts w:ascii="Calibri" w:hAnsi="Calibri"/>
-          <w:b/>
           <w:color w:val="1A237E"/>
           <w:sz w:val="24"/>
         </w:rPr>
-        <w:t>Supplementary Table. Comparison of SVI and ADI as Predictors of</w:t>
-        <w:br/>
-        <w:t>ACR-Accredited Cardiac Imaging Capacity (Negative Binomial Regression)</w:t>
+        <w:t>Supplementary Table. ADI Sensitivity Analysis: Regression Results and Quintile Stratification</w:t>
+      </w:r>
+    </w:p>
+    <w:p>
+      <w:r>
+        <w:t>Area Deprivation Index constructed via Principal Component Analysis of 6 ACS socioeconomic indicators (first component explains 58.7% of variance). National percentile rank: 0 = least deprived, 100 = most deprived.</w:t>
+      </w:r>
+    </w:p>
+    <w:p>
+      <w:pPr>
+        <w:pStyle w:val="Heading2"/>
+      </w:pPr>
+      <w:r>
+        <w:t>A. Negative Binomial Regression Results</w:t>
       </w:r>
     </w:p>
     <w:tbl>
       <w:tblPr>
+        <w:tblStyle w:val="MediumShading1-Accent1"/>
         <w:tblW w:type="auto" w:w="0"/>
         <w:jc w:val="center"/>
         <w:tblLook w:firstColumn="1" w:firstRow="1" w:lastColumn="0" w:lastRow="0" w:noHBand="0" w:noVBand="1" w:val="04A0"/>
       </w:tblPr>
       <w:tblGrid>
-        <w:gridCol w:w="1440"/>
-        <w:gridCol w:w="1440"/>
-        <w:gridCol w:w="1440"/>
-        <w:gridCol w:w="1440"/>
-        <w:gridCol w:w="1440"/>
-        <w:gridCol w:w="1440"/>
+        <w:gridCol w:w="1080"/>
+        <w:gridCol w:w="1080"/>
+        <w:gridCol w:w="1080"/>
+        <w:gridCol w:w="1080"/>
+        <w:gridCol w:w="1080"/>
+        <w:gridCol w:w="1080"/>
+        <w:gridCol w:w="1080"/>
+        <w:gridCol w:w="1080"/>
       </w:tblGrid>
       <w:tr>
         <w:tc>
           <w:tcPr>
-            <w:tcW w:type="dxa" w:w="1440"/>
-            <w:shd w:fill="1A237E"/>
+            <w:tcW w:type="dxa" w:w="1080"/>
             <w:vAlign w:val="center"/>
-            <w:tcBorders>
-              <w:top w:val="single" w:sz="12" w:color="000000"/>
-              <w:bottom w:val="single" w:sz="8" w:color="000000"/>
-            </w:tcBorders>
           </w:tcPr>
           <w:p>
             <w:pPr>
               <w:jc w:val="center"/>
             </w:pPr>
+            <w:r/>
             <w:r>
               <w:rPr>
                 <w:rFonts w:ascii="Calibri" w:hAnsi="Calibri"/>
                 <w:b/>
-                <w:color w:val="FFFFFF"/>
-                <w:sz w:val="20"/>
-              </w:rPr>
-              <w:t>Predictor</w:t>
-            </w:r>
-          </w:p>
-        </w:tc>
-        <w:tc>
-          <w:tcPr>
-            <w:tcW w:type="dxa" w:w="1440"/>
-            <w:shd w:fill="1A237E"/>
-            <w:vAlign w:val="center"/>
-            <w:tcBorders>
-              <w:top w:val="single" w:sz="12" w:color="000000"/>
-              <w:bottom w:val="single" w:sz="8" w:color="000000"/>
-            </w:tcBorders>
-          </w:tcPr>
-          <w:p>
-            <w:pPr>
-              <w:jc w:val="center"/>
-            </w:pPr>
-            <w:r>
-              <w:rPr>
-                <w:rFonts w:ascii="Calibri" w:hAnsi="Calibri"/>
-                <w:b/>
-                <w:color w:val="FFFFFF"/>
-                <w:sz w:val="20"/>
+                <w:sz w:val="18"/>
               </w:rPr>
               <w:t>Modality</w:t>
             </w:r>
@@ -85,24 +67,19 @@
         </w:tc>
         <w:tc>
           <w:tcPr>
-            <w:tcW w:type="dxa" w:w="1440"/>
-            <w:shd w:fill="1A237E"/>
+            <w:tcW w:type="dxa" w:w="1080"/>
             <w:vAlign w:val="center"/>
-            <w:tcBorders>
-              <w:top w:val="single" w:sz="12" w:color="000000"/>
-              <w:bottom w:val="single" w:sz="8" w:color="000000"/>
-            </w:tcBorders>
           </w:tcPr>
           <w:p>
             <w:pPr>
               <w:jc w:val="center"/>
             </w:pPr>
+            <w:r/>
             <w:r>
               <w:rPr>
                 <w:rFonts w:ascii="Calibri" w:hAnsi="Calibri"/>
                 <w:b/>
-                <w:color w:val="FFFFFF"/>
-                <w:sz w:val="20"/>
+                <w:sz w:val="18"/>
               </w:rPr>
               <w:t>IRR</w:t>
             </w:r>
@@ -110,24 +87,19 @@
         </w:tc>
         <w:tc>
           <w:tcPr>
-            <w:tcW w:type="dxa" w:w="1440"/>
-            <w:shd w:fill="1A237E"/>
+            <w:tcW w:type="dxa" w:w="1080"/>
             <w:vAlign w:val="center"/>
-            <w:tcBorders>
-              <w:top w:val="single" w:sz="12" w:color="000000"/>
-              <w:bottom w:val="single" w:sz="8" w:color="000000"/>
-            </w:tcBorders>
           </w:tcPr>
           <w:p>
             <w:pPr>
               <w:jc w:val="center"/>
             </w:pPr>
+            <w:r/>
             <w:r>
               <w:rPr>
                 <w:rFonts w:ascii="Calibri" w:hAnsi="Calibri"/>
                 <w:b/>
-                <w:color w:val="FFFFFF"/>
-                <w:sz w:val="20"/>
+                <w:sz w:val="18"/>
               </w:rPr>
               <w:t>95% CI</w:t>
             </w:r>
@@ -135,24 +107,19 @@
         </w:tc>
         <w:tc>
           <w:tcPr>
-            <w:tcW w:type="dxa" w:w="1440"/>
-            <w:shd w:fill="1A237E"/>
+            <w:tcW w:type="dxa" w:w="1080"/>
             <w:vAlign w:val="center"/>
-            <w:tcBorders>
-              <w:top w:val="single" w:sz="12" w:color="000000"/>
-              <w:bottom w:val="single" w:sz="8" w:color="000000"/>
-            </w:tcBorders>
           </w:tcPr>
           <w:p>
             <w:pPr>
               <w:jc w:val="center"/>
             </w:pPr>
+            <w:r/>
             <w:r>
               <w:rPr>
                 <w:rFonts w:ascii="Calibri" w:hAnsi="Calibri"/>
                 <w:b/>
-                <w:color w:val="FFFFFF"/>
-                <w:sz w:val="20"/>
+                <w:sz w:val="18"/>
               </w:rPr>
               <w:t>p-value</w:t>
             </w:r>
@@ -160,26 +127,81 @@
         </w:tc>
         <w:tc>
           <w:tcPr>
-            <w:tcW w:type="dxa" w:w="1440"/>
-            <w:shd w:fill="1A237E"/>
+            <w:tcW w:type="dxa" w:w="1080"/>
             <w:vAlign w:val="center"/>
-            <w:tcBorders>
-              <w:top w:val="single" w:sz="12" w:color="000000"/>
-              <w:bottom w:val="single" w:sz="8" w:color="000000"/>
-            </w:tcBorders>
           </w:tcPr>
           <w:p>
             <w:pPr>
               <w:jc w:val="center"/>
             </w:pPr>
+            <w:r/>
             <w:r>
               <w:rPr>
                 <w:rFonts w:ascii="Calibri" w:hAnsi="Calibri"/>
                 <w:b/>
-                <w:color w:val="FFFFFF"/>
-                <w:sz w:val="20"/>
+                <w:sz w:val="18"/>
               </w:rPr>
-              <w:t>Significant</w:t>
+              <w:t>N</w:t>
+            </w:r>
+          </w:p>
+        </w:tc>
+        <w:tc>
+          <w:tcPr>
+            <w:tcW w:type="dxa" w:w="1080"/>
+            <w:vAlign w:val="center"/>
+          </w:tcPr>
+          <w:p>
+            <w:pPr>
+              <w:jc w:val="center"/>
+            </w:pPr>
+            <w:r/>
+            <w:r>
+              <w:rPr>
+                <w:rFonts w:ascii="Calibri" w:hAnsi="Calibri"/>
+                <w:b/>
+                <w:sz w:val="18"/>
+              </w:rPr>
+              <w:t>NegBin AIC</w:t>
+            </w:r>
+          </w:p>
+        </w:tc>
+        <w:tc>
+          <w:tcPr>
+            <w:tcW w:type="dxa" w:w="1080"/>
+            <w:vAlign w:val="center"/>
+          </w:tcPr>
+          <w:p>
+            <w:pPr>
+              <w:jc w:val="center"/>
+            </w:pPr>
+            <w:r/>
+            <w:r>
+              <w:rPr>
+                <w:rFonts w:ascii="Calibri" w:hAnsi="Calibri"/>
+                <w:b/>
+                <w:sz w:val="18"/>
+              </w:rPr>
+              <w:t>Poisson AIC</w:t>
+            </w:r>
+          </w:p>
+        </w:tc>
+        <w:tc>
+          <w:tcPr>
+            <w:tcW w:type="dxa" w:w="1080"/>
+            <w:vAlign w:val="center"/>
+          </w:tcPr>
+          <w:p>
+            <w:pPr>
+              <w:jc w:val="center"/>
+            </w:pPr>
+            <w:r/>
+            <w:r>
+              <w:rPr>
+                <w:rFonts w:ascii="Calibri" w:hAnsi="Calibri"/>
+                <w:b/>
+                <w:sz w:val="18"/>
+              </w:rPr>
+              <w:t>Preferred</w:t>
             </w:r>
           </w:p>
         </w:tc>
@@ -187,37 +209,19 @@
       <w:tr>
         <w:tc>
           <w:tcPr>
-            <w:tcW w:type="dxa" w:w="1440"/>
+            <w:tcW w:type="dxa" w:w="1080"/>
             <w:vAlign w:val="center"/>
-            <w:shd w:fill="E8F5E9"/>
           </w:tcPr>
           <w:p>
             <w:pPr>
               <w:jc w:val="center"/>
             </w:pPr>
+            <w:r/>
             <w:r>
               <w:rPr>
                 <w:rFonts w:ascii="Calibri" w:hAnsi="Calibri"/>
-                <w:sz w:val="19"/>
-              </w:rPr>
-              <w:t>SVI per 10-pctl</w:t>
-            </w:r>
-          </w:p>
-        </w:tc>
-        <w:tc>
-          <w:tcPr>
-            <w:tcW w:type="dxa" w:w="1440"/>
-            <w:vAlign w:val="center"/>
-            <w:shd w:fill="E8F5E9"/>
-          </w:tcPr>
-          <w:p>
-            <w:pPr>
-              <w:jc w:val="center"/>
-            </w:pPr>
-            <w:r>
-              <w:rPr>
-                <w:rFonts w:ascii="Calibri" w:hAnsi="Calibri"/>
-                <w:sz w:val="19"/>
+                <w:b w:val="0"/>
+                <w:sz w:val="18"/>
               </w:rPr>
               <w:t>CMR</w:t>
             </w:r>
@@ -225,77 +229,141 @@
         </w:tc>
         <w:tc>
           <w:tcPr>
-            <w:tcW w:type="dxa" w:w="1440"/>
+            <w:tcW w:type="dxa" w:w="1080"/>
             <w:vAlign w:val="center"/>
-            <w:shd w:fill="E8F5E9"/>
           </w:tcPr>
           <w:p>
             <w:pPr>
               <w:jc w:val="center"/>
             </w:pPr>
+            <w:r/>
             <w:r>
               <w:rPr>
                 <w:rFonts w:ascii="Calibri" w:hAnsi="Calibri"/>
-                <w:sz w:val="19"/>
+                <w:b/>
+                <w:sz w:val="18"/>
               </w:rPr>
-              <w:t>0.992</w:t>
+              <w:t>0.9373</w:t>
             </w:r>
           </w:p>
         </w:tc>
         <w:tc>
           <w:tcPr>
-            <w:tcW w:type="dxa" w:w="1440"/>
+            <w:tcW w:type="dxa" w:w="1080"/>
             <w:vAlign w:val="center"/>
-            <w:shd w:fill="E8F5E9"/>
           </w:tcPr>
           <w:p>
             <w:pPr>
               <w:jc w:val="center"/>
             </w:pPr>
+            <w:r/>
             <w:r>
               <w:rPr>
                 <w:rFonts w:ascii="Calibri" w:hAnsi="Calibri"/>
-                <w:sz w:val="19"/>
+                <w:b w:val="0"/>
+                <w:sz w:val="18"/>
               </w:rPr>
-              <w:t>0.952–1.033</w:t>
+              <w:t>0.900 - 0.976</w:t>
             </w:r>
           </w:p>
         </w:tc>
         <w:tc>
           <w:tcPr>
-            <w:tcW w:type="dxa" w:w="1440"/>
+            <w:tcW w:type="dxa" w:w="1080"/>
             <w:vAlign w:val="center"/>
-            <w:shd w:fill="E8F5E9"/>
           </w:tcPr>
           <w:p>
             <w:pPr>
               <w:jc w:val="center"/>
             </w:pPr>
+            <w:r/>
             <w:r>
               <w:rPr>
                 <w:rFonts w:ascii="Calibri" w:hAnsi="Calibri"/>
-                <w:sz w:val="19"/>
+                <w:b/>
+                <w:sz w:val="18"/>
               </w:rPr>
-              <w:t>0.681</w:t>
+              <w:t>0.0018</w:t>
             </w:r>
           </w:p>
         </w:tc>
         <w:tc>
           <w:tcPr>
-            <w:tcW w:type="dxa" w:w="1440"/>
+            <w:tcW w:type="dxa" w:w="1080"/>
             <w:vAlign w:val="center"/>
-            <w:shd w:fill="E8F5E9"/>
           </w:tcPr>
           <w:p>
             <w:pPr>
               <w:jc w:val="center"/>
             </w:pPr>
+            <w:r/>
             <w:r>
               <w:rPr>
                 <w:rFonts w:ascii="Calibri" w:hAnsi="Calibri"/>
-                <w:sz w:val="19"/>
+                <w:b w:val="0"/>
+                <w:sz w:val="18"/>
               </w:rPr>
-              <w:t>No</w:t>
+              <w:t>3,029</w:t>
+            </w:r>
+          </w:p>
+        </w:tc>
+        <w:tc>
+          <w:tcPr>
+            <w:tcW w:type="dxa" w:w="1080"/>
+            <w:vAlign w:val="center"/>
+          </w:tcPr>
+          <w:p>
+            <w:pPr>
+              <w:jc w:val="center"/>
+            </w:pPr>
+            <w:r/>
+            <w:r>
+              <w:rPr>
+                <w:rFonts w:ascii="Calibri" w:hAnsi="Calibri"/>
+                <w:b w:val="0"/>
+                <w:sz w:val="18"/>
+              </w:rPr>
+              <w:t>1831.0</w:t>
+            </w:r>
+          </w:p>
+        </w:tc>
+        <w:tc>
+          <w:tcPr>
+            <w:tcW w:type="dxa" w:w="1080"/>
+            <w:vAlign w:val="center"/>
+          </w:tcPr>
+          <w:p>
+            <w:pPr>
+              <w:jc w:val="center"/>
+            </w:pPr>
+            <w:r/>
+            <w:r>
+              <w:rPr>
+                <w:rFonts w:ascii="Calibri" w:hAnsi="Calibri"/>
+                <w:b w:val="0"/>
+                <w:sz w:val="18"/>
+              </w:rPr>
+              <w:t>1908.9</w:t>
+            </w:r>
+          </w:p>
+        </w:tc>
+        <w:tc>
+          <w:tcPr>
+            <w:tcW w:type="dxa" w:w="1080"/>
+            <w:vAlign w:val="center"/>
+          </w:tcPr>
+          <w:p>
+            <w:pPr>
+              <w:jc w:val="center"/>
+            </w:pPr>
+            <w:r/>
+            <w:r>
+              <w:rPr>
+                <w:rFonts w:ascii="Calibri" w:hAnsi="Calibri"/>
+                <w:b w:val="0"/>
+                <w:sz w:val="18"/>
+              </w:rPr>
+              <w:t>NegBin</w:t>
             </w:r>
           </w:p>
         </w:tc>
@@ -303,35 +371,19 @@
       <w:tr>
         <w:tc>
           <w:tcPr>
-            <w:tcW w:type="dxa" w:w="1440"/>
+            <w:tcW w:type="dxa" w:w="1080"/>
             <w:vAlign w:val="center"/>
           </w:tcPr>
           <w:p>
             <w:pPr>
               <w:jc w:val="center"/>
             </w:pPr>
+            <w:r/>
             <w:r>
               <w:rPr>
                 <w:rFonts w:ascii="Calibri" w:hAnsi="Calibri"/>
-                <w:sz w:val="19"/>
-              </w:rPr>
-              <w:t>SVI per 10-pctl</w:t>
-            </w:r>
-          </w:p>
-        </w:tc>
-        <w:tc>
-          <w:tcPr>
-            <w:tcW w:type="dxa" w:w="1440"/>
-            <w:vAlign w:val="center"/>
-          </w:tcPr>
-          <w:p>
-            <w:pPr>
-              <w:jc w:val="center"/>
-            </w:pPr>
-            <w:r>
-              <w:rPr>
-                <w:rFonts w:ascii="Calibri" w:hAnsi="Calibri"/>
-                <w:sz w:val="19"/>
+                <w:b w:val="0"/>
+                <w:sz w:val="18"/>
               </w:rPr>
               <w:t>CCT</w:t>
             </w:r>
@@ -339,73 +391,309 @@
         </w:tc>
         <w:tc>
           <w:tcPr>
-            <w:tcW w:type="dxa" w:w="1440"/>
+            <w:tcW w:type="dxa" w:w="1080"/>
             <w:vAlign w:val="center"/>
           </w:tcPr>
           <w:p>
             <w:pPr>
               <w:jc w:val="center"/>
             </w:pPr>
+            <w:r/>
             <w:r>
               <w:rPr>
                 <w:rFonts w:ascii="Calibri" w:hAnsi="Calibri"/>
-                <w:sz w:val="19"/>
+                <w:b w:val="0"/>
+                <w:sz w:val="18"/>
               </w:rPr>
-              <w:t>1.020</w:t>
+              <w:t>0.9789</w:t>
             </w:r>
           </w:p>
         </w:tc>
         <w:tc>
           <w:tcPr>
-            <w:tcW w:type="dxa" w:w="1440"/>
+            <w:tcW w:type="dxa" w:w="1080"/>
             <w:vAlign w:val="center"/>
           </w:tcPr>
           <w:p>
             <w:pPr>
               <w:jc w:val="center"/>
             </w:pPr>
+            <w:r/>
             <w:r>
               <w:rPr>
                 <w:rFonts w:ascii="Calibri" w:hAnsi="Calibri"/>
-                <w:sz w:val="19"/>
+                <w:b w:val="0"/>
+                <w:sz w:val="18"/>
               </w:rPr>
-              <w:t>0.989–1.053</w:t>
+              <w:t>0.949 - 1.010</w:t>
             </w:r>
           </w:p>
         </w:tc>
         <w:tc>
           <w:tcPr>
-            <w:tcW w:type="dxa" w:w="1440"/>
+            <w:tcW w:type="dxa" w:w="1080"/>
             <w:vAlign w:val="center"/>
           </w:tcPr>
           <w:p>
             <w:pPr>
               <w:jc w:val="center"/>
             </w:pPr>
+            <w:r/>
             <w:r>
               <w:rPr>
                 <w:rFonts w:ascii="Calibri" w:hAnsi="Calibri"/>
-                <w:sz w:val="19"/>
+                <w:b w:val="0"/>
+                <w:sz w:val="18"/>
               </w:rPr>
-              <w:t>0.213</w:t>
+              <w:t>0.1767</w:t>
             </w:r>
           </w:p>
         </w:tc>
         <w:tc>
           <w:tcPr>
-            <w:tcW w:type="dxa" w:w="1440"/>
+            <w:tcW w:type="dxa" w:w="1080"/>
             <w:vAlign w:val="center"/>
           </w:tcPr>
           <w:p>
             <w:pPr>
               <w:jc w:val="center"/>
             </w:pPr>
+            <w:r/>
             <w:r>
               <w:rPr>
                 <w:rFonts w:ascii="Calibri" w:hAnsi="Calibri"/>
-                <w:sz w:val="19"/>
+                <w:b w:val="0"/>
+                <w:sz w:val="18"/>
               </w:rPr>
-              <w:t>No</w:t>
+              <w:t>3,029</w:t>
+            </w:r>
+          </w:p>
+        </w:tc>
+        <w:tc>
+          <w:tcPr>
+            <w:tcW w:type="dxa" w:w="1080"/>
+            <w:vAlign w:val="center"/>
+          </w:tcPr>
+          <w:p>
+            <w:pPr>
+              <w:jc w:val="center"/>
+            </w:pPr>
+            <w:r/>
+            <w:r>
+              <w:rPr>
+                <w:rFonts w:ascii="Calibri" w:hAnsi="Calibri"/>
+                <w:b w:val="0"/>
+                <w:sz w:val="18"/>
+              </w:rPr>
+              <w:t>3055.4</w:t>
+            </w:r>
+          </w:p>
+        </w:tc>
+        <w:tc>
+          <w:tcPr>
+            <w:tcW w:type="dxa" w:w="1080"/>
+            <w:vAlign w:val="center"/>
+          </w:tcPr>
+          <w:p>
+            <w:pPr>
+              <w:jc w:val="center"/>
+            </w:pPr>
+            <w:r/>
+            <w:r>
+              <w:rPr>
+                <w:rFonts w:ascii="Calibri" w:hAnsi="Calibri"/>
+                <w:b w:val="0"/>
+                <w:sz w:val="18"/>
+              </w:rPr>
+              <w:t>3083.2</w:t>
+            </w:r>
+          </w:p>
+        </w:tc>
+        <w:tc>
+          <w:tcPr>
+            <w:tcW w:type="dxa" w:w="1080"/>
+            <w:vAlign w:val="center"/>
+          </w:tcPr>
+          <w:p>
+            <w:pPr>
+              <w:jc w:val="center"/>
+            </w:pPr>
+            <w:r/>
+            <w:r>
+              <w:rPr>
+                <w:rFonts w:ascii="Calibri" w:hAnsi="Calibri"/>
+                <w:b w:val="0"/>
+                <w:sz w:val="18"/>
+              </w:rPr>
+              <w:t>NegBin</w:t>
+            </w:r>
+          </w:p>
+        </w:tc>
+      </w:tr>
+    </w:tbl>
+    <w:p/>
+    <w:p>
+      <w:pPr>
+        <w:pStyle w:val="Heading2"/>
+      </w:pPr>
+      <w:r>
+        <w:t>B. Mean Facility Rates by ADI Quintile</w:t>
+      </w:r>
+    </w:p>
+    <w:tbl>
+      <w:tblPr>
+        <w:tblStyle w:val="MediumShading1-Accent1"/>
+        <w:tblW w:type="auto" w:w="0"/>
+        <w:jc w:val="center"/>
+        <w:tblLook w:firstColumn="1" w:firstRow="1" w:lastColumn="0" w:lastRow="0" w:noHBand="0" w:noVBand="1" w:val="04A0"/>
+      </w:tblPr>
+      <w:tblGrid>
+        <w:gridCol w:w="1234"/>
+        <w:gridCol w:w="1234"/>
+        <w:gridCol w:w="1234"/>
+        <w:gridCol w:w="1234"/>
+        <w:gridCol w:w="1234"/>
+        <w:gridCol w:w="1234"/>
+        <w:gridCol w:w="1234"/>
+      </w:tblGrid>
+      <w:tr>
+        <w:tc>
+          <w:tcPr>
+            <w:tcW w:type="dxa" w:w="1234"/>
+            <w:vAlign w:val="center"/>
+          </w:tcPr>
+          <w:p>
+            <w:pPr>
+              <w:jc w:val="center"/>
+            </w:pPr>
+            <w:r/>
+            <w:r>
+              <w:rPr>
+                <w:rFonts w:ascii="Calibri" w:hAnsi="Calibri"/>
+                <w:b/>
+                <w:sz w:val="18"/>
+              </w:rPr>
+              <w:t>ADI Quintile</w:t>
+            </w:r>
+          </w:p>
+        </w:tc>
+        <w:tc>
+          <w:tcPr>
+            <w:tcW w:type="dxa" w:w="1234"/>
+            <w:vAlign w:val="center"/>
+          </w:tcPr>
+          <w:p>
+            <w:pPr>
+              <w:jc w:val="center"/>
+            </w:pPr>
+            <w:r/>
+            <w:r>
+              <w:rPr>
+                <w:rFonts w:ascii="Calibri" w:hAnsi="Calibri"/>
+                <w:b/>
+                <w:sz w:val="18"/>
+              </w:rPr>
+              <w:t>Description</w:t>
+            </w:r>
+          </w:p>
+        </w:tc>
+        <w:tc>
+          <w:tcPr>
+            <w:tcW w:type="dxa" w:w="1234"/>
+            <w:vAlign w:val="center"/>
+          </w:tcPr>
+          <w:p>
+            <w:pPr>
+              <w:jc w:val="center"/>
+            </w:pPr>
+            <w:r/>
+            <w:r>
+              <w:rPr>
+                <w:rFonts w:ascii="Calibri" w:hAnsi="Calibri"/>
+                <w:b/>
+                <w:sz w:val="18"/>
+              </w:rPr>
+              <w:t>N Counties</w:t>
+            </w:r>
+          </w:p>
+        </w:tc>
+        <w:tc>
+          <w:tcPr>
+            <w:tcW w:type="dxa" w:w="1234"/>
+            <w:vAlign w:val="center"/>
+          </w:tcPr>
+          <w:p>
+            <w:pPr>
+              <w:jc w:val="center"/>
+            </w:pPr>
+            <w:r/>
+            <w:r>
+              <w:rPr>
+                <w:rFonts w:ascii="Calibri" w:hAnsi="Calibri"/>
+                <w:b/>
+                <w:sz w:val="18"/>
+              </w:rPr>
+              <w:t>CMR Rate (mean)</w:t>
+            </w:r>
+          </w:p>
+        </w:tc>
+        <w:tc>
+          <w:tcPr>
+            <w:tcW w:type="dxa" w:w="1234"/>
+            <w:vAlign w:val="center"/>
+          </w:tcPr>
+          <w:p>
+            <w:pPr>
+              <w:jc w:val="center"/>
+            </w:pPr>
+            <w:r/>
+            <w:r>
+              <w:rPr>
+                <w:rFonts w:ascii="Calibri" w:hAnsi="Calibri"/>
+                <w:b/>
+                <w:sz w:val="18"/>
+              </w:rPr>
+              <w:t>CMR Rate (SEM)</w:t>
+            </w:r>
+          </w:p>
+        </w:tc>
+        <w:tc>
+          <w:tcPr>
+            <w:tcW w:type="dxa" w:w="1234"/>
+            <w:vAlign w:val="center"/>
+          </w:tcPr>
+          <w:p>
+            <w:pPr>
+              <w:jc w:val="center"/>
+            </w:pPr>
+            <w:r/>
+            <w:r>
+              <w:rPr>
+                <w:rFonts w:ascii="Calibri" w:hAnsi="Calibri"/>
+                <w:b/>
+                <w:sz w:val="18"/>
+              </w:rPr>
+              <w:t>CCT Rate (mean)</w:t>
+            </w:r>
+          </w:p>
+        </w:tc>
+        <w:tc>
+          <w:tcPr>
+            <w:tcW w:type="dxa" w:w="1234"/>
+            <w:vAlign w:val="center"/>
+          </w:tcPr>
+          <w:p>
+            <w:pPr>
+              <w:jc w:val="center"/>
+            </w:pPr>
+            <w:r/>
+            <w:r>
+              <w:rPr>
+                <w:rFonts w:ascii="Calibri" w:hAnsi="Calibri"/>
+                <w:b/>
+                <w:sz w:val="18"/>
+              </w:rPr>
+              <w:t>CCT Rate (SEM)</w:t>
             </w:r>
           </w:p>
         </w:tc>
@@ -413,133 +701,141 @@
       <w:tr>
         <w:tc>
           <w:tcPr>
-            <w:tcW w:type="dxa" w:w="1440"/>
+            <w:tcW w:type="dxa" w:w="1234"/>
             <w:vAlign w:val="center"/>
-            <w:shd w:fill="E8F5E9"/>
-            <w:shd w:fill="FFF8E1"/>
           </w:tcPr>
           <w:p>
             <w:pPr>
               <w:jc w:val="center"/>
             </w:pPr>
+            <w:r/>
             <w:r>
               <w:rPr>
                 <w:rFonts w:ascii="Calibri" w:hAnsi="Calibri"/>
-                <w:b/>
-                <w:color w:val="00695C"/>
-                <w:sz w:val="19"/>
+                <w:b w:val="0"/>
+                <w:sz w:val="18"/>
               </w:rPr>
-              <w:t>ADI per 10-pctl</w:t>
+              <w:t>Q1</w:t>
             </w:r>
           </w:p>
         </w:tc>
         <w:tc>
           <w:tcPr>
-            <w:tcW w:type="dxa" w:w="1440"/>
+            <w:tcW w:type="dxa" w:w="1234"/>
             <w:vAlign w:val="center"/>
-            <w:shd w:fill="E8F5E9"/>
-            <w:shd w:fill="FFF8E1"/>
           </w:tcPr>
           <w:p>
             <w:pPr>
               <w:jc w:val="center"/>
             </w:pPr>
+            <w:r/>
             <w:r>
               <w:rPr>
                 <w:rFonts w:ascii="Calibri" w:hAnsi="Calibri"/>
-                <w:b/>
-                <w:color w:val="00695C"/>
-                <w:sz w:val="19"/>
+                <w:b w:val="0"/>
+                <w:sz w:val="18"/>
               </w:rPr>
-              <w:t>CMR</w:t>
+              <w:t>Least deprived</w:t>
             </w:r>
           </w:p>
         </w:tc>
         <w:tc>
           <w:tcPr>
-            <w:tcW w:type="dxa" w:w="1440"/>
+            <w:tcW w:type="dxa" w:w="1234"/>
             <w:vAlign w:val="center"/>
-            <w:shd w:fill="E8F5E9"/>
-            <w:shd w:fill="FFF8E1"/>
           </w:tcPr>
           <w:p>
             <w:pPr>
               <w:jc w:val="center"/>
             </w:pPr>
+            <w:r/>
             <w:r>
               <w:rPr>
                 <w:rFonts w:ascii="Calibri" w:hAnsi="Calibri"/>
-                <w:b/>
-                <w:color w:val="00695C"/>
-                <w:sz w:val="19"/>
+                <w:b w:val="0"/>
+                <w:sz w:val="18"/>
               </w:rPr>
-              <w:t>0.9373</w:t>
+              <w:t>606</w:t>
             </w:r>
           </w:p>
         </w:tc>
         <w:tc>
           <w:tcPr>
-            <w:tcW w:type="dxa" w:w="1440"/>
+            <w:tcW w:type="dxa" w:w="1234"/>
             <w:vAlign w:val="center"/>
-            <w:shd w:fill="E8F5E9"/>
-            <w:shd w:fill="FFF8E1"/>
           </w:tcPr>
           <w:p>
             <w:pPr>
               <w:jc w:val="center"/>
             </w:pPr>
+            <w:r/>
             <w:r>
               <w:rPr>
                 <w:rFonts w:ascii="Calibri" w:hAnsi="Calibri"/>
-                <w:b/>
-                <w:color w:val="00695C"/>
-                <w:sz w:val="19"/>
+                <w:b w:val="0"/>
+                <w:sz w:val="18"/>
               </w:rPr>
-              <w:t>0.9000–0.9762</w:t>
+              <w:t>0.2715</w:t>
             </w:r>
           </w:p>
         </w:tc>
         <w:tc>
           <w:tcPr>
-            <w:tcW w:type="dxa" w:w="1440"/>
+            <w:tcW w:type="dxa" w:w="1234"/>
             <w:vAlign w:val="center"/>
-            <w:shd w:fill="E8F5E9"/>
-            <w:shd w:fill="FFF8E1"/>
           </w:tcPr>
           <w:p>
             <w:pPr>
               <w:jc w:val="center"/>
             </w:pPr>
+            <w:r/>
             <w:r>
               <w:rPr>
                 <w:rFonts w:ascii="Calibri" w:hAnsi="Calibri"/>
-                <w:b/>
-                <w:color w:val="00695C"/>
-                <w:sz w:val="19"/>
+                <w:b w:val="0"/>
+                <w:sz w:val="18"/>
               </w:rPr>
-              <w:t>0.0018</w:t>
+              <w:t>0.0361</w:t>
             </w:r>
           </w:p>
         </w:tc>
         <w:tc>
           <w:tcPr>
-            <w:tcW w:type="dxa" w:w="1440"/>
+            <w:tcW w:type="dxa" w:w="1234"/>
             <w:vAlign w:val="center"/>
-            <w:shd w:fill="E8F5E9"/>
-            <w:shd w:fill="FFF8E1"/>
           </w:tcPr>
           <w:p>
             <w:pPr>
               <w:jc w:val="center"/>
             </w:pPr>
+            <w:r/>
             <w:r>
               <w:rPr>
                 <w:rFonts w:ascii="Calibri" w:hAnsi="Calibri"/>
-                <w:b/>
-                <w:color w:val="00695C"/>
-                <w:sz w:val="19"/>
+                <w:b w:val="0"/>
+                <w:sz w:val="18"/>
               </w:rPr>
-              <w:t>Yes **</w:t>
+              <w:t>0.6017</w:t>
+            </w:r>
+          </w:p>
+        </w:tc>
+        <w:tc>
+          <w:tcPr>
+            <w:tcW w:type="dxa" w:w="1234"/>
+            <w:vAlign w:val="center"/>
+          </w:tcPr>
+          <w:p>
+            <w:pPr>
+              <w:jc w:val="center"/>
+            </w:pPr>
+            <w:r/>
+            <w:r>
+              <w:rPr>
+                <w:rFonts w:ascii="Calibri" w:hAnsi="Calibri"/>
+                <w:b w:val="0"/>
+                <w:sz w:val="18"/>
+              </w:rPr>
+              <w:t>0.0595</w:t>
             </w:r>
           </w:p>
         </w:tc>
@@ -547,139 +843,709 @@
       <w:tr>
         <w:tc>
           <w:tcPr>
-            <w:tcW w:type="dxa" w:w="1440"/>
+            <w:tcW w:type="dxa" w:w="1234"/>
             <w:vAlign w:val="center"/>
-            <w:shd w:fill="FFF8E1"/>
-            <w:tcBorders>
-              <w:top w:val="single" w:sz="4" w:color="000000"/>
-              <w:bottom w:val="single" w:sz="12" w:color="000000"/>
-            </w:tcBorders>
           </w:tcPr>
           <w:p>
             <w:pPr>
               <w:jc w:val="center"/>
             </w:pPr>
+            <w:r/>
             <w:r>
               <w:rPr>
                 <w:rFonts w:ascii="Calibri" w:hAnsi="Calibri"/>
-                <w:sz w:val="19"/>
+                <w:b w:val="0"/>
+                <w:sz w:val="18"/>
               </w:rPr>
-              <w:t>ADI per 10-pctl</w:t>
+              <w:t>Q2</w:t>
             </w:r>
           </w:p>
         </w:tc>
         <w:tc>
           <w:tcPr>
-            <w:tcW w:type="dxa" w:w="1440"/>
+            <w:tcW w:type="dxa" w:w="1234"/>
             <w:vAlign w:val="center"/>
-            <w:shd w:fill="FFF8E1"/>
-            <w:tcBorders>
-              <w:top w:val="single" w:sz="4" w:color="000000"/>
-              <w:bottom w:val="single" w:sz="12" w:color="000000"/>
-            </w:tcBorders>
           </w:tcPr>
           <w:p>
             <w:pPr>
               <w:jc w:val="center"/>
             </w:pPr>
+            <w:r/>
             <w:r>
               <w:rPr>
                 <w:rFonts w:ascii="Calibri" w:hAnsi="Calibri"/>
-                <w:sz w:val="19"/>
+                <w:b w:val="0"/>
+                <w:sz w:val="18"/>
               </w:rPr>
-              <w:t>CCT</w:t>
+              <w:t>Low-moderate</w:t>
             </w:r>
           </w:p>
         </w:tc>
         <w:tc>
           <w:tcPr>
-            <w:tcW w:type="dxa" w:w="1440"/>
+            <w:tcW w:type="dxa" w:w="1234"/>
             <w:vAlign w:val="center"/>
-            <w:shd w:fill="FFF8E1"/>
-            <w:tcBorders>
-              <w:top w:val="single" w:sz="4" w:color="000000"/>
-              <w:bottom w:val="single" w:sz="12" w:color="000000"/>
-            </w:tcBorders>
           </w:tcPr>
           <w:p>
             <w:pPr>
               <w:jc w:val="center"/>
             </w:pPr>
+            <w:r/>
             <w:r>
               <w:rPr>
                 <w:rFonts w:ascii="Calibri" w:hAnsi="Calibri"/>
-                <w:sz w:val="19"/>
+                <w:b w:val="0"/>
+                <w:sz w:val="18"/>
               </w:rPr>
-              <w:t>0.9789</w:t>
+              <w:t>606</w:t>
             </w:r>
           </w:p>
         </w:tc>
         <w:tc>
           <w:tcPr>
-            <w:tcW w:type="dxa" w:w="1440"/>
+            <w:tcW w:type="dxa" w:w="1234"/>
             <w:vAlign w:val="center"/>
-            <w:shd w:fill="FFF8E1"/>
-            <w:tcBorders>
-              <w:top w:val="single" w:sz="4" w:color="000000"/>
-              <w:bottom w:val="single" w:sz="12" w:color="000000"/>
-            </w:tcBorders>
           </w:tcPr>
           <w:p>
             <w:pPr>
               <w:jc w:val="center"/>
             </w:pPr>
+            <w:r/>
             <w:r>
               <w:rPr>
                 <w:rFonts w:ascii="Calibri" w:hAnsi="Calibri"/>
-                <w:sz w:val="19"/>
+                <w:b w:val="0"/>
+                <w:sz w:val="18"/>
               </w:rPr>
-              <w:t>0.9490–1.0097</w:t>
+              <w:t>0.1491</w:t>
             </w:r>
           </w:p>
         </w:tc>
         <w:tc>
           <w:tcPr>
-            <w:tcW w:type="dxa" w:w="1440"/>
+            <w:tcW w:type="dxa" w:w="1234"/>
             <w:vAlign w:val="center"/>
-            <w:shd w:fill="FFF8E1"/>
-            <w:tcBorders>
-              <w:top w:val="single" w:sz="4" w:color="000000"/>
-              <w:bottom w:val="single" w:sz="12" w:color="000000"/>
-            </w:tcBorders>
           </w:tcPr>
           <w:p>
             <w:pPr>
               <w:jc w:val="center"/>
             </w:pPr>
+            <w:r/>
             <w:r>
               <w:rPr>
                 <w:rFonts w:ascii="Calibri" w:hAnsi="Calibri"/>
-                <w:sz w:val="19"/>
+                <w:b w:val="0"/>
+                <w:sz w:val="18"/>
               </w:rPr>
-              <w:t>0.1767</w:t>
+              <w:t>0.0253</w:t>
             </w:r>
           </w:p>
         </w:tc>
         <w:tc>
           <w:tcPr>
-            <w:tcW w:type="dxa" w:w="1440"/>
+            <w:tcW w:type="dxa" w:w="1234"/>
             <w:vAlign w:val="center"/>
-            <w:shd w:fill="FFF8E1"/>
-            <w:tcBorders>
-              <w:top w:val="single" w:sz="4" w:color="000000"/>
-              <w:bottom w:val="single" w:sz="12" w:color="000000"/>
-            </w:tcBorders>
           </w:tcPr>
           <w:p>
             <w:pPr>
               <w:jc w:val="center"/>
             </w:pPr>
+            <w:r/>
             <w:r>
               <w:rPr>
                 <w:rFonts w:ascii="Calibri" w:hAnsi="Calibri"/>
-                <w:sz w:val="19"/>
+                <w:b w:val="0"/>
+                <w:sz w:val="18"/>
               </w:rPr>
-              <w:t>No</w:t>
+              <w:t>0.4034</w:t>
+            </w:r>
+          </w:p>
+        </w:tc>
+        <w:tc>
+          <w:tcPr>
+            <w:tcW w:type="dxa" w:w="1234"/>
+            <w:vAlign w:val="center"/>
+          </w:tcPr>
+          <w:p>
+            <w:pPr>
+              <w:jc w:val="center"/>
+            </w:pPr>
+            <w:r/>
+            <w:r>
+              <w:rPr>
+                <w:rFonts w:ascii="Calibri" w:hAnsi="Calibri"/>
+                <w:b w:val="0"/>
+                <w:sz w:val="18"/>
+              </w:rPr>
+              <w:t>0.0468</w:t>
+            </w:r>
+          </w:p>
+        </w:tc>
+      </w:tr>
+      <w:tr>
+        <w:tc>
+          <w:tcPr>
+            <w:tcW w:type="dxa" w:w="1234"/>
+            <w:vAlign w:val="center"/>
+          </w:tcPr>
+          <w:p>
+            <w:pPr>
+              <w:jc w:val="center"/>
+            </w:pPr>
+            <w:r/>
+            <w:r>
+              <w:rPr>
+                <w:rFonts w:ascii="Calibri" w:hAnsi="Calibri"/>
+                <w:b w:val="0"/>
+                <w:sz w:val="18"/>
+              </w:rPr>
+              <w:t>Q3</w:t>
+            </w:r>
+          </w:p>
+        </w:tc>
+        <w:tc>
+          <w:tcPr>
+            <w:tcW w:type="dxa" w:w="1234"/>
+            <w:vAlign w:val="center"/>
+          </w:tcPr>
+          <w:p>
+            <w:pPr>
+              <w:jc w:val="center"/>
+            </w:pPr>
+            <w:r/>
+            <w:r>
+              <w:rPr>
+                <w:rFonts w:ascii="Calibri" w:hAnsi="Calibri"/>
+                <w:b w:val="0"/>
+                <w:sz w:val="18"/>
+              </w:rPr>
+              <w:t>Moderate</w:t>
+            </w:r>
+          </w:p>
+        </w:tc>
+        <w:tc>
+          <w:tcPr>
+            <w:tcW w:type="dxa" w:w="1234"/>
+            <w:vAlign w:val="center"/>
+          </w:tcPr>
+          <w:p>
+            <w:pPr>
+              <w:jc w:val="center"/>
+            </w:pPr>
+            <w:r/>
+            <w:r>
+              <w:rPr>
+                <w:rFonts w:ascii="Calibri" w:hAnsi="Calibri"/>
+                <w:b w:val="0"/>
+                <w:sz w:val="18"/>
+              </w:rPr>
+              <w:t>605</w:t>
+            </w:r>
+          </w:p>
+        </w:tc>
+        <w:tc>
+          <w:tcPr>
+            <w:tcW w:type="dxa" w:w="1234"/>
+            <w:vAlign w:val="center"/>
+          </w:tcPr>
+          <w:p>
+            <w:pPr>
+              <w:jc w:val="center"/>
+            </w:pPr>
+            <w:r/>
+            <w:r>
+              <w:rPr>
+                <w:rFonts w:ascii="Calibri" w:hAnsi="Calibri"/>
+                <w:b w:val="0"/>
+                <w:sz w:val="18"/>
+              </w:rPr>
+              <w:t>0.1870</w:t>
+            </w:r>
+          </w:p>
+        </w:tc>
+        <w:tc>
+          <w:tcPr>
+            <w:tcW w:type="dxa" w:w="1234"/>
+            <w:vAlign w:val="center"/>
+          </w:tcPr>
+          <w:p>
+            <w:pPr>
+              <w:jc w:val="center"/>
+            </w:pPr>
+            <w:r/>
+            <w:r>
+              <w:rPr>
+                <w:rFonts w:ascii="Calibri" w:hAnsi="Calibri"/>
+                <w:b w:val="0"/>
+                <w:sz w:val="18"/>
+              </w:rPr>
+              <w:t>0.0305</w:t>
+            </w:r>
+          </w:p>
+        </w:tc>
+        <w:tc>
+          <w:tcPr>
+            <w:tcW w:type="dxa" w:w="1234"/>
+            <w:vAlign w:val="center"/>
+          </w:tcPr>
+          <w:p>
+            <w:pPr>
+              <w:jc w:val="center"/>
+            </w:pPr>
+            <w:r/>
+            <w:r>
+              <w:rPr>
+                <w:rFonts w:ascii="Calibri" w:hAnsi="Calibri"/>
+                <w:b w:val="0"/>
+                <w:sz w:val="18"/>
+              </w:rPr>
+              <w:t>0.5666</w:t>
+            </w:r>
+          </w:p>
+        </w:tc>
+        <w:tc>
+          <w:tcPr>
+            <w:tcW w:type="dxa" w:w="1234"/>
+            <w:vAlign w:val="center"/>
+          </w:tcPr>
+          <w:p>
+            <w:pPr>
+              <w:jc w:val="center"/>
+            </w:pPr>
+            <w:r/>
+            <w:r>
+              <w:rPr>
+                <w:rFonts w:ascii="Calibri" w:hAnsi="Calibri"/>
+                <w:b w:val="0"/>
+                <w:sz w:val="18"/>
+              </w:rPr>
+              <w:t>0.0752</w:t>
+            </w:r>
+          </w:p>
+        </w:tc>
+      </w:tr>
+      <w:tr>
+        <w:tc>
+          <w:tcPr>
+            <w:tcW w:type="dxa" w:w="1234"/>
+            <w:vAlign w:val="center"/>
+          </w:tcPr>
+          <w:p>
+            <w:pPr>
+              <w:jc w:val="center"/>
+            </w:pPr>
+            <w:r/>
+            <w:r>
+              <w:rPr>
+                <w:rFonts w:ascii="Calibri" w:hAnsi="Calibri"/>
+                <w:b w:val="0"/>
+                <w:sz w:val="18"/>
+              </w:rPr>
+              <w:t>Q4</w:t>
+            </w:r>
+          </w:p>
+        </w:tc>
+        <w:tc>
+          <w:tcPr>
+            <w:tcW w:type="dxa" w:w="1234"/>
+            <w:vAlign w:val="center"/>
+          </w:tcPr>
+          <w:p>
+            <w:pPr>
+              <w:jc w:val="center"/>
+            </w:pPr>
+            <w:r/>
+            <w:r>
+              <w:rPr>
+                <w:rFonts w:ascii="Calibri" w:hAnsi="Calibri"/>
+                <w:b w:val="0"/>
+                <w:sz w:val="18"/>
+              </w:rPr>
+              <w:t>Moderate-high</w:t>
+            </w:r>
+          </w:p>
+        </w:tc>
+        <w:tc>
+          <w:tcPr>
+            <w:tcW w:type="dxa" w:w="1234"/>
+            <w:vAlign w:val="center"/>
+          </w:tcPr>
+          <w:p>
+            <w:pPr>
+              <w:jc w:val="center"/>
+            </w:pPr>
+            <w:r/>
+            <w:r>
+              <w:rPr>
+                <w:rFonts w:ascii="Calibri" w:hAnsi="Calibri"/>
+                <w:b w:val="0"/>
+                <w:sz w:val="18"/>
+              </w:rPr>
+              <w:t>606</w:t>
+            </w:r>
+          </w:p>
+        </w:tc>
+        <w:tc>
+          <w:tcPr>
+            <w:tcW w:type="dxa" w:w="1234"/>
+            <w:vAlign w:val="center"/>
+          </w:tcPr>
+          <w:p>
+            <w:pPr>
+              <w:jc w:val="center"/>
+            </w:pPr>
+            <w:r/>
+            <w:r>
+              <w:rPr>
+                <w:rFonts w:ascii="Calibri" w:hAnsi="Calibri"/>
+                <w:b w:val="0"/>
+                <w:sz w:val="18"/>
+              </w:rPr>
+              <w:t>0.0806</w:t>
+            </w:r>
+          </w:p>
+        </w:tc>
+        <w:tc>
+          <w:tcPr>
+            <w:tcW w:type="dxa" w:w="1234"/>
+            <w:vAlign w:val="center"/>
+          </w:tcPr>
+          <w:p>
+            <w:pPr>
+              <w:jc w:val="center"/>
+            </w:pPr>
+            <w:r/>
+            <w:r>
+              <w:rPr>
+                <w:rFonts w:ascii="Calibri" w:hAnsi="Calibri"/>
+                <w:b w:val="0"/>
+                <w:sz w:val="18"/>
+              </w:rPr>
+              <w:t>0.0181</w:t>
+            </w:r>
+          </w:p>
+        </w:tc>
+        <w:tc>
+          <w:tcPr>
+            <w:tcW w:type="dxa" w:w="1234"/>
+            <w:vAlign w:val="center"/>
+          </w:tcPr>
+          <w:p>
+            <w:pPr>
+              <w:jc w:val="center"/>
+            </w:pPr>
+            <w:r/>
+            <w:r>
+              <w:rPr>
+                <w:rFonts w:ascii="Calibri" w:hAnsi="Calibri"/>
+                <w:b w:val="0"/>
+                <w:sz w:val="18"/>
+              </w:rPr>
+              <w:t>0.5970</w:t>
+            </w:r>
+          </w:p>
+        </w:tc>
+        <w:tc>
+          <w:tcPr>
+            <w:tcW w:type="dxa" w:w="1234"/>
+            <w:vAlign w:val="center"/>
+          </w:tcPr>
+          <w:p>
+            <w:pPr>
+              <w:jc w:val="center"/>
+            </w:pPr>
+            <w:r/>
+            <w:r>
+              <w:rPr>
+                <w:rFonts w:ascii="Calibri" w:hAnsi="Calibri"/>
+                <w:b w:val="0"/>
+                <w:sz w:val="18"/>
+              </w:rPr>
+              <w:t>0.0933</w:t>
+            </w:r>
+          </w:p>
+        </w:tc>
+      </w:tr>
+      <w:tr>
+        <w:tc>
+          <w:tcPr>
+            <w:tcW w:type="dxa" w:w="1234"/>
+            <w:vAlign w:val="center"/>
+          </w:tcPr>
+          <w:p>
+            <w:pPr>
+              <w:jc w:val="center"/>
+            </w:pPr>
+            <w:r/>
+            <w:r>
+              <w:rPr>
+                <w:rFonts w:ascii="Calibri" w:hAnsi="Calibri"/>
+                <w:b w:val="0"/>
+                <w:sz w:val="18"/>
+              </w:rPr>
+              <w:t>Q5</w:t>
+            </w:r>
+          </w:p>
+        </w:tc>
+        <w:tc>
+          <w:tcPr>
+            <w:tcW w:type="dxa" w:w="1234"/>
+            <w:vAlign w:val="center"/>
+          </w:tcPr>
+          <w:p>
+            <w:pPr>
+              <w:jc w:val="center"/>
+            </w:pPr>
+            <w:r/>
+            <w:r>
+              <w:rPr>
+                <w:rFonts w:ascii="Calibri" w:hAnsi="Calibri"/>
+                <w:b w:val="0"/>
+                <w:sz w:val="18"/>
+              </w:rPr>
+              <w:t>Most deprived</w:t>
+            </w:r>
+          </w:p>
+        </w:tc>
+        <w:tc>
+          <w:tcPr>
+            <w:tcW w:type="dxa" w:w="1234"/>
+            <w:vAlign w:val="center"/>
+          </w:tcPr>
+          <w:p>
+            <w:pPr>
+              <w:jc w:val="center"/>
+            </w:pPr>
+            <w:r/>
+            <w:r>
+              <w:rPr>
+                <w:rFonts w:ascii="Calibri" w:hAnsi="Calibri"/>
+                <w:b w:val="0"/>
+                <w:sz w:val="18"/>
+              </w:rPr>
+              <w:t>606</w:t>
+            </w:r>
+          </w:p>
+        </w:tc>
+        <w:tc>
+          <w:tcPr>
+            <w:tcW w:type="dxa" w:w="1234"/>
+            <w:vAlign w:val="center"/>
+          </w:tcPr>
+          <w:p>
+            <w:pPr>
+              <w:jc w:val="center"/>
+            </w:pPr>
+            <w:r/>
+            <w:r>
+              <w:rPr>
+                <w:rFonts w:ascii="Calibri" w:hAnsi="Calibri"/>
+                <w:b w:val="0"/>
+                <w:sz w:val="18"/>
+              </w:rPr>
+              <w:t>0.0622</w:t>
+            </w:r>
+          </w:p>
+        </w:tc>
+        <w:tc>
+          <w:tcPr>
+            <w:tcW w:type="dxa" w:w="1234"/>
+            <w:vAlign w:val="center"/>
+          </w:tcPr>
+          <w:p>
+            <w:pPr>
+              <w:jc w:val="center"/>
+            </w:pPr>
+            <w:r/>
+            <w:r>
+              <w:rPr>
+                <w:rFonts w:ascii="Calibri" w:hAnsi="Calibri"/>
+                <w:b w:val="0"/>
+                <w:sz w:val="18"/>
+              </w:rPr>
+              <w:t>0.0187</w:t>
+            </w:r>
+          </w:p>
+        </w:tc>
+        <w:tc>
+          <w:tcPr>
+            <w:tcW w:type="dxa" w:w="1234"/>
+            <w:vAlign w:val="center"/>
+          </w:tcPr>
+          <w:p>
+            <w:pPr>
+              <w:jc w:val="center"/>
+            </w:pPr>
+            <w:r/>
+            <w:r>
+              <w:rPr>
+                <w:rFonts w:ascii="Calibri" w:hAnsi="Calibri"/>
+                <w:b w:val="0"/>
+                <w:sz w:val="18"/>
+              </w:rPr>
+              <w:t>0.3437</w:t>
+            </w:r>
+          </w:p>
+        </w:tc>
+        <w:tc>
+          <w:tcPr>
+            <w:tcW w:type="dxa" w:w="1234"/>
+            <w:vAlign w:val="center"/>
+          </w:tcPr>
+          <w:p>
+            <w:pPr>
+              <w:jc w:val="center"/>
+            </w:pPr>
+            <w:r/>
+            <w:r>
+              <w:rPr>
+                <w:rFonts w:ascii="Calibri" w:hAnsi="Calibri"/>
+                <w:b w:val="0"/>
+                <w:sz w:val="18"/>
+              </w:rPr>
+              <w:t>0.0979</w:t>
+            </w:r>
+          </w:p>
+        </w:tc>
+      </w:tr>
+      <w:tr>
+        <w:tc>
+          <w:tcPr>
+            <w:tcW w:type="dxa" w:w="1234"/>
+            <w:vAlign w:val="center"/>
+          </w:tcPr>
+          <w:p>
+            <w:pPr>
+              <w:jc w:val="center"/>
+            </w:pPr>
+            <w:r/>
+            <w:r>
+              <w:rPr>
+                <w:rFonts w:ascii="Calibri" w:hAnsi="Calibri"/>
+                <w:b/>
+                <w:sz w:val="18"/>
+              </w:rPr>
+              <w:t>Q1/Q5 Ratio</w:t>
+            </w:r>
+          </w:p>
+        </w:tc>
+        <w:tc>
+          <w:tcPr>
+            <w:tcW w:type="dxa" w:w="1234"/>
+            <w:vAlign w:val="center"/>
+          </w:tcPr>
+          <w:p>
+            <w:pPr>
+              <w:jc w:val="center"/>
+            </w:pPr>
+            <w:r/>
+            <w:r>
+              <w:rPr>
+                <w:rFonts w:ascii="Calibri" w:hAnsi="Calibri"/>
+                <w:b w:val="0"/>
+                <w:sz w:val="18"/>
+              </w:rPr>
+              <w:t>Disparity</w:t>
+            </w:r>
+          </w:p>
+        </w:tc>
+        <w:tc>
+          <w:tcPr>
+            <w:tcW w:type="dxa" w:w="1234"/>
+            <w:vAlign w:val="center"/>
+          </w:tcPr>
+          <w:p>
+            <w:pPr>
+              <w:jc w:val="center"/>
+            </w:pPr>
+            <w:r/>
+            <w:r>
+              <w:rPr>
+                <w:rFonts w:ascii="Calibri" w:hAnsi="Calibri"/>
+                <w:b w:val="0"/>
+                <w:sz w:val="18"/>
+              </w:rPr>
+              <w:t>--</w:t>
+            </w:r>
+          </w:p>
+        </w:tc>
+        <w:tc>
+          <w:tcPr>
+            <w:tcW w:type="dxa" w:w="1234"/>
+            <w:vAlign w:val="center"/>
+          </w:tcPr>
+          <w:p>
+            <w:pPr>
+              <w:jc w:val="center"/>
+            </w:pPr>
+            <w:r/>
+            <w:r>
+              <w:rPr>
+                <w:rFonts w:ascii="Calibri" w:hAnsi="Calibri"/>
+                <w:b/>
+                <w:sz w:val="18"/>
+              </w:rPr>
+              <w:t>4.4x</w:t>
+            </w:r>
+          </w:p>
+        </w:tc>
+        <w:tc>
+          <w:tcPr>
+            <w:tcW w:type="dxa" w:w="1234"/>
+            <w:vAlign w:val="center"/>
+          </w:tcPr>
+          <w:p>
+            <w:pPr>
+              <w:jc w:val="center"/>
+            </w:pPr>
+            <w:r/>
+            <w:r>
+              <w:rPr>
+                <w:rFonts w:ascii="Calibri" w:hAnsi="Calibri"/>
+                <w:b w:val="0"/>
+                <w:sz w:val="18"/>
+              </w:rPr>
+              <w:t>--</w:t>
+            </w:r>
+          </w:p>
+        </w:tc>
+        <w:tc>
+          <w:tcPr>
+            <w:tcW w:type="dxa" w:w="1234"/>
+            <w:vAlign w:val="center"/>
+          </w:tcPr>
+          <w:p>
+            <w:pPr>
+              <w:jc w:val="center"/>
+            </w:pPr>
+            <w:r/>
+            <w:r>
+              <w:rPr>
+                <w:rFonts w:ascii="Calibri" w:hAnsi="Calibri"/>
+                <w:b/>
+                <w:sz w:val="18"/>
+              </w:rPr>
+              <w:t>1.8x</w:t>
+            </w:r>
+          </w:p>
+        </w:tc>
+        <w:tc>
+          <w:tcPr>
+            <w:tcW w:type="dxa" w:w="1234"/>
+            <w:vAlign w:val="center"/>
+          </w:tcPr>
+          <w:p>
+            <w:pPr>
+              <w:jc w:val="center"/>
+            </w:pPr>
+            <w:r/>
+            <w:r>
+              <w:rPr>
+                <w:rFonts w:ascii="Calibri" w:hAnsi="Calibri"/>
+                <w:b w:val="0"/>
+                <w:sz w:val="18"/>
+              </w:rPr>
+              <w:t>--</w:t>
             </w:r>
           </w:p>
         </w:tc>
@@ -693,7 +1559,7 @@
           <w:color w:val="444444"/>
           <w:sz w:val="17"/>
         </w:rPr>
-        <w:t>Model: Count ~ NegBin(mu, alpha), log(mu) = B0 + B1*predictor + offset(ln[pop &gt;= 45]). n = 3,029.</w:t>
+        <w:t>Rate = ACR-accredited facilities per 100,000 adults aged 45+. SEM = Standard Error of the Mean.</w:t>
       </w:r>
     </w:p>
     <w:p>
@@ -703,7 +1569,7 @@
           <w:color w:val="444444"/>
           <w:sz w:val="17"/>
         </w:rPr>
-        <w:t>** p &lt; 0.05.</w:t>
+        <w:t>Kruskal-Wallis test across quintiles: CMR p &lt; 0.0001; CCT p &lt; 0.0001.</w:t>
       </w:r>
     </w:p>
     <w:p>
@@ -713,7 +1579,7 @@
           <w:color w:val="444444"/>
           <w:sz w:val="17"/>
         </w:rPr>
-        <w:t>SVI = CDC Social Vulnerability Index 2022 (overall RPL_THEMES). ADI = Area Deprivation Index, constructed via PCA of 6 ACS socioeconomic indicators (Singh 2003 methodology).</w:t>
+        <w:t>ADI constructed via PCA of: % below 150% poverty, % unemployed, % no HS diploma, % housing cost-burdened, median household income (inverted), % children in poverty.</w:t>
       </w:r>
     </w:p>
     <w:p>
@@ -723,22 +1589,12 @@
           <w:color w:val="444444"/>
           <w:sz w:val="17"/>
         </w:rPr>
-        <w:t>Spearman (ADI vs rate): CMR rho = -0.1715 (p &lt; 0.0001); CCT rho = -0.1632 (p &lt; 0.0001).</w:t>
-      </w:r>
-    </w:p>
-    <w:p>
-      <w:r>
-        <w:rPr>
-          <w:rFonts w:ascii="Calibri" w:hAnsi="Calibri"/>
-          <w:color w:val="444444"/>
-          <w:sz w:val="17"/>
-        </w:rPr>
-        <w:t>Key Finding: ADI detects a 6.3% decrease in CMR capacity per 10-pctl increase in deprivation that SVI misses. This supports ADI as the more sensitive measure for cardiac imaging access disparities.</w:t>
+        <w:t>Source indicators from CDC SVI 2022 (county-level) and County Health Rankings 2024.</w:t>
       </w:r>
     </w:p>
     <w:sectPr>
       <w:pgSz w:w="12240" w:h="15840"/>
-      <w:pgMar w:top="1134" w:right="1800" w:bottom="1134" w:left="1800" w:header="720" w:footer="720" w:gutter="0"/>
+      <w:pgMar w:top="1440" w:right="1800" w:bottom="1440" w:left="1800" w:header="720" w:footer="720" w:gutter="0"/>
       <w:cols w:space="720"/>
       <w:docGrid w:linePitch="360"/>
     </w:sectPr>
@@ -1109,6 +1965,10 @@
     <w:name w:val="Normal"/>
     <w:qFormat/>
     <w:rsid w:val="00FC693F"/>
+    <w:rPr>
+      <w:rFonts w:ascii="Calibri" w:hAnsi="Calibri"/>
+      <w:sz w:val="20"/>
+    </w:rPr>
   </w:style>
   <w:style w:type="paragraph" w:styleId="Header">
     <w:name w:val="header"/>

</xml_diff>